<commit_message>
docs: stamp diagrams with copyright ID LY2026wo4941; add all 6 to report
- Add copyright line (© 2026 Dugong Watch · Copyright ID: LY2026wo4941) to
  every diagram across .png/.svg/.drawio
- Add the pipeline and change-detection diagrams to the report so all six
  diagrams are included; rebuild the 24-page docx/pdf

Co-Authored-By: Claude Opus 4.8 <noreply@anthropic.com>
</commit_message>
<xml_diff>
--- a/docs/Dugong_Watch_Submission.docx
+++ b/docs/Dugong_Watch_Submission.docx
@@ -643,7 +643,7 @@
       <w:r>
         <w:drawing>
           <wp:inline>
-            <wp:extent cx="5334000" cy="1167488"/>
+            <wp:extent cx="5334000" cy="1189108"/>
             <wp:effectExtent b="0" l="0" r="0" t="0"/>
             <wp:docPr descr="System architecture: free satellite imagery and official survey data flow through Google Earth Engine into a machine-learning classifier and a weighted risk model, producing a ranked, auditable output delivered as an interactive dashboard and report." title="" id="13" name="Picture"/>
             <a:graphic>
@@ -664,7 +664,7 @@
                   <pic:spPr bwMode="auto">
                     <a:xfrm>
                       <a:off x="0" y="0"/>
-                      <a:ext cx="5334000" cy="1167488"/>
+                      <a:ext cx="5334000" cy="1189108"/>
                     </a:xfrm>
                     <a:prstGeom prst="rect">
                       <a:avLst/>
@@ -1483,7 +1483,7 @@
     </w:p>
     <w:bookmarkEnd w:id="21"/>
     <w:bookmarkEnd w:id="22"/>
-    <w:bookmarkStart w:id="40" w:name="methodology"/>
+    <w:bookmarkStart w:id="46" w:name="methodology"/>
     <w:p>
       <w:pPr>
         <w:pStyle w:val="Heading1"/>
@@ -1555,235 +1555,6 @@
       </w:r>
       <w:r>
         <w:t xml:space="preserve">both of which have been run against live data and verified.</w:t>
-      </w:r>
-    </w:p>
-    <w:bookmarkStart w:id="26" w:name="study-area-and-data"/>
-    <w:p>
-      <w:pPr>
-        <w:pStyle w:val="Heading2"/>
-      </w:pPr>
-      <w:r>
-        <w:t xml:space="preserve">3.1 Study area and data</w:t>
-      </w:r>
-    </w:p>
-    <w:p>
-      <w:pPr>
-        <w:pStyle w:val="FirstParagraph"/>
-      </w:pPr>
-      <w:r>
-        <w:t xml:space="preserve">The study area is a 774.6 km² polygon covering the Marawah / Bu Tinah</w:t>
-      </w:r>
-      <w:r>
-        <w:t xml:space="preserve"> </w:t>
-      </w:r>
-      <w:r>
-        <w:t xml:space="preserve">region of the Arabian Gulf, Abu Dhabi (lon 52.98–53.32, lat 24.19–24.48),</w:t>
-      </w:r>
-      <w:r>
-        <w:t xml:space="preserve"> </w:t>
-      </w:r>
-      <w:r>
-        <w:t xml:space="preserve">falling entirely inside the Marawah Marine Biosphere Reserve.</w:t>
-      </w:r>
-    </w:p>
-    <w:p>
-      <w:pPr>
-        <w:pStyle w:val="BodyText"/>
-      </w:pPr>
-      <w:r>
-        <w:rPr>
-          <w:b/>
-          <w:bCs/>
-        </w:rPr>
-        <w:t xml:space="preserve">Satellite imagery:</w:t>
-      </w:r>
-      <w:r>
-        <w:t xml:space="preserve"> </w:t>
-      </w:r>
-      <w:r>
-        <w:t xml:space="preserve">Sentinel-2 Surface Reflectance (Level-2A,</w:t>
-      </w:r>
-      <w:r>
-        <w:t xml:space="preserve"> </w:t>
-      </w:r>
-      <w:r>
-        <w:rPr>
-          <w:rStyle w:val="VerbatimChar"/>
-        </w:rPr>
-        <w:t xml:space="preserve">COPERNICUS/S2_SR_HARMONIZED</w:t>
-      </w:r>
-      <w:r>
-        <w:t xml:space="preserve">), accessed via Google Earth Engine, cloud</w:t>
-      </w:r>
-      <w:r>
-        <w:t xml:space="preserve"> </w:t>
-      </w:r>
-      <w:r>
-        <w:t xml:space="preserve">masked using the QA60 band (cloud and cirrus bits), median-composited per</w:t>
-      </w:r>
-      <w:r>
-        <w:t xml:space="preserve"> </w:t>
-      </w:r>
-      <w:r>
-        <w:t xml:space="preserve">year. For 2024, 222 individual Sentinel-2 scenes contributed to the</w:t>
-      </w:r>
-      <w:r>
-        <w:t xml:space="preserve"> </w:t>
-      </w:r>
-      <w:r>
-        <w:t xml:space="preserve">cloud-free composite. Two annual composites are built for comparison: 2019</w:t>
-      </w:r>
-      <w:r>
-        <w:t xml:space="preserve"> </w:t>
-      </w:r>
-      <w:r>
-        <w:t xml:space="preserve">(past) and 2024 (current).</w:t>
-      </w:r>
-    </w:p>
-    <w:p>
-      <w:pPr>
-        <w:pStyle w:val="BodyText"/>
-      </w:pPr>
-      <w:r>
-        <w:rPr>
-          <w:b/>
-          <w:bCs/>
-        </w:rPr>
-        <w:t xml:space="preserve">Thermal data:</w:t>
-      </w:r>
-      <w:r>
-        <w:t xml:space="preserve"> </w:t>
-      </w:r>
-      <w:r>
-        <w:t xml:space="preserve">Landsat 8/9 Collection 2 surface temperature (</w:t>
-      </w:r>
-      <w:r>
-        <w:rPr>
-          <w:rStyle w:val="VerbatimChar"/>
-        </w:rPr>
-        <w:t xml:space="preserve">ST_B10</w:t>
-      </w:r>
-      <w:r>
-        <w:t xml:space="preserve">),</w:t>
-      </w:r>
-      <w:r>
-        <w:t xml:space="preserve"> </w:t>
-      </w:r>
-      <w:r>
-        <w:t xml:space="preserve">summer months only (June–September, the annual thermal maximum), converted</w:t>
-      </w:r>
-      <w:r>
-        <w:t xml:space="preserve"> </w:t>
-      </w:r>
-      <w:r>
-        <w:t xml:space="preserve">to Celsius and masked to water pixels only (using the Sentinel-2 composite’s</w:t>
-      </w:r>
-      <w:r>
-        <w:t xml:space="preserve"> </w:t>
-      </w:r>
-      <w:r>
-        <w:t xml:space="preserve">MNDWI band) so that hot dry land cannot skew the thermal-stress signal.</w:t>
-      </w:r>
-    </w:p>
-    <w:p>
-      <w:pPr>
-        <w:pStyle w:val="BodyText"/>
-      </w:pPr>
-      <w:r>
-        <w:rPr>
-          <w:b/>
-          <w:bCs/>
-        </w:rPr>
-        <w:t xml:space="preserve">Training and reference data:</w:t>
-      </w:r>
-      <w:r>
-        <w:t xml:space="preserve"> </w:t>
-      </w:r>
-      <w:r>
-        <w:t xml:space="preserve">vector habitat polygons from the</w:t>
-      </w:r>
-      <w:r>
-        <w:t xml:space="preserve"> </w:t>
-      </w:r>
-      <w:r>
-        <w:t xml:space="preserve">Environment Agency – Abu Dhabi (EAD), clipped to the study area:</w:t>
-      </w:r>
-      <w:r>
-        <w:t xml:space="preserve"> </w:t>
-      </w:r>
-      <w:r>
-        <w:t xml:space="preserve">- 118 seagrass-bed polygons and 171 unconsolidated-bottom (non-seagrass)</w:t>
-      </w:r>
-      <w:r>
-        <w:t xml:space="preserve"> </w:t>
-      </w:r>
-      <w:r>
-        <w:t xml:space="preserve">polygons, used as positive/negative training data.</w:t>
-      </w:r>
-      <w:r>
-        <w:t xml:space="preserve"> </w:t>
-      </w:r>
-      <w:r>
-        <w:t xml:space="preserve">- A further 118-polygon EAD seagrass layer, kept entirely separate from</w:t>
-      </w:r>
-      <w:r>
-        <w:t xml:space="preserve"> </w:t>
-      </w:r>
-      <w:r>
-        <w:t xml:space="preserve">training, used as an independent reference/validation layer.</w:t>
-      </w:r>
-      <w:r>
-        <w:t xml:space="preserve"> </w:t>
-      </w:r>
-      <w:r>
-        <w:t xml:space="preserve">- A region-wide EAD seagrass layer (1,954 polygons, ~2,922 km²) used for</w:t>
-      </w:r>
-      <w:r>
-        <w:t xml:space="preserve"> </w:t>
-      </w:r>
-      <w:r>
-        <w:t xml:space="preserve">broader context, not for training or accuracy assessment.</w:t>
-      </w:r>
-    </w:p>
-    <w:p>
-      <w:pPr>
-        <w:pStyle w:val="BodyText"/>
-      </w:pPr>
-      <w:r>
-        <w:t xml:space="preserve">All vector data uses WGS84/CRS84 coordinates. The binary class scheme</w:t>
-      </w:r>
-      <w:r>
-        <w:t xml:space="preserve"> </w:t>
-      </w:r>
-      <w:r>
-        <w:t xml:space="preserve">(</w:t>
-      </w:r>
-      <w:r>
-        <w:rPr>
-          <w:rStyle w:val="VerbatimChar"/>
-        </w:rPr>
-        <w:t xml:space="preserve">1 = seagrass</w:t>
-      </w:r>
-      <w:r>
-        <w:t xml:space="preserve">,</w:t>
-      </w:r>
-      <w:r>
-        <w:t xml:space="preserve"> </w:t>
-      </w:r>
-      <w:r>
-        <w:rPr>
-          <w:rStyle w:val="VerbatimChar"/>
-        </w:rPr>
-        <w:t xml:space="preserve">0 = non-seagrass</w:t>
-      </w:r>
-      <w:r>
-        <w:t xml:space="preserve">) was locked to match this training</w:t>
-      </w:r>
-      <w:r>
-        <w:t xml:space="preserve"> </w:t>
-      </w:r>
-      <w:r>
-        <w:t xml:space="preserve">data’s own structure, replacing an earlier four-class design.</w:t>
       </w:r>
     </w:p>
     <w:p>
@@ -1793,20 +1564,304 @@
       <w:r>
         <w:drawing>
           <wp:inline>
-            <wp:extent cx="5334000" cy="5009130"/>
+            <wp:extent cx="5334000" cy="6664071"/>
             <wp:effectExtent b="0" l="0" r="0" t="0"/>
-            <wp:docPr descr="Official EAD seagrass reference beds (118 polygons) within the 774.6 km² study area — the ground truth the classifier is trained and validated against." title="" id="24" name="Picture"/>
+            <wp:docPr descr="The five-track pipeline: each track (A–E) hands its output to the next, from data acquisition through machine learning, risk modelling, the dashboard, and this report." title="" id="24" name="Picture"/>
             <a:graphic>
               <a:graphicData uri="http://schemas.openxmlformats.org/drawingml/2006/picture">
                 <pic:pic>
                   <pic:nvPicPr>
-                    <pic:cNvPr descr="../D_dashboard/figures/B_ead_seagrass_extent.png" id="25" name="Picture"/>
+                    <pic:cNvPr descr="../diagrams/2_five_track_pipeline.png" id="25" name="Picture"/>
                     <pic:cNvPicPr>
                       <a:picLocks noChangeArrowheads="1" noChangeAspect="1"/>
                     </pic:cNvPicPr>
                   </pic:nvPicPr>
                   <pic:blipFill>
                     <a:blip r:embed="rId23"/>
+                    <a:stretch>
+                      <a:fillRect/>
+                    </a:stretch>
+                  </pic:blipFill>
+                  <pic:spPr bwMode="auto">
+                    <a:xfrm>
+                      <a:off x="0" y="0"/>
+                      <a:ext cx="5334000" cy="6664071"/>
+                    </a:xfrm>
+                    <a:prstGeom prst="rect">
+                      <a:avLst/>
+                    </a:prstGeom>
+                    <a:noFill/>
+                    <a:ln w="9525">
+                      <a:noFill/>
+                      <a:headEnd/>
+                      <a:tailEnd/>
+                    </a:ln>
+                  </pic:spPr>
+                </pic:pic>
+              </a:graphicData>
+            </a:graphic>
+          </wp:inline>
+        </w:drawing>
+      </w:r>
+    </w:p>
+    <w:p>
+      <w:pPr>
+        <w:pStyle w:val="ImageCaption"/>
+      </w:pPr>
+      <w:r>
+        <w:t xml:space="preserve">The five-track pipeline: each track (A–E) hands its output to the next, from data acquisition through machine learning, risk modelling, the dashboard, and this report.</w:t>
+      </w:r>
+    </w:p>
+    <w:bookmarkStart w:id="29" w:name="study-area-and-data"/>
+    <w:p>
+      <w:pPr>
+        <w:pStyle w:val="Heading2"/>
+      </w:pPr>
+      <w:r>
+        <w:t xml:space="preserve">3.1 Study area and data</w:t>
+      </w:r>
+    </w:p>
+    <w:p>
+      <w:pPr>
+        <w:pStyle w:val="FirstParagraph"/>
+      </w:pPr>
+      <w:r>
+        <w:t xml:space="preserve">The study area is a 774.6 km² polygon covering the Marawah / Bu Tinah</w:t>
+      </w:r>
+      <w:r>
+        <w:t xml:space="preserve"> </w:t>
+      </w:r>
+      <w:r>
+        <w:t xml:space="preserve">region of the Arabian Gulf, Abu Dhabi (lon 52.98–53.32, lat 24.19–24.48),</w:t>
+      </w:r>
+      <w:r>
+        <w:t xml:space="preserve"> </w:t>
+      </w:r>
+      <w:r>
+        <w:t xml:space="preserve">falling entirely inside the Marawah Marine Biosphere Reserve.</w:t>
+      </w:r>
+    </w:p>
+    <w:p>
+      <w:pPr>
+        <w:pStyle w:val="BodyText"/>
+      </w:pPr>
+      <w:r>
+        <w:rPr>
+          <w:b/>
+          <w:bCs/>
+        </w:rPr>
+        <w:t xml:space="preserve">Satellite imagery:</w:t>
+      </w:r>
+      <w:r>
+        <w:t xml:space="preserve"> </w:t>
+      </w:r>
+      <w:r>
+        <w:t xml:space="preserve">Sentinel-2 Surface Reflectance (Level-2A,</w:t>
+      </w:r>
+      <w:r>
+        <w:t xml:space="preserve"> </w:t>
+      </w:r>
+      <w:r>
+        <w:rPr>
+          <w:rStyle w:val="VerbatimChar"/>
+        </w:rPr>
+        <w:t xml:space="preserve">COPERNICUS/S2_SR_HARMONIZED</w:t>
+      </w:r>
+      <w:r>
+        <w:t xml:space="preserve">), accessed via Google Earth Engine, cloud</w:t>
+      </w:r>
+      <w:r>
+        <w:t xml:space="preserve"> </w:t>
+      </w:r>
+      <w:r>
+        <w:t xml:space="preserve">masked using the QA60 band (cloud and cirrus bits), median-composited per</w:t>
+      </w:r>
+      <w:r>
+        <w:t xml:space="preserve"> </w:t>
+      </w:r>
+      <w:r>
+        <w:t xml:space="preserve">year. For 2024, 222 individual Sentinel-2 scenes contributed to the</w:t>
+      </w:r>
+      <w:r>
+        <w:t xml:space="preserve"> </w:t>
+      </w:r>
+      <w:r>
+        <w:t xml:space="preserve">cloud-free composite. Two annual composites are built for comparison: 2019</w:t>
+      </w:r>
+      <w:r>
+        <w:t xml:space="preserve"> </w:t>
+      </w:r>
+      <w:r>
+        <w:t xml:space="preserve">(past) and 2024 (current).</w:t>
+      </w:r>
+    </w:p>
+    <w:p>
+      <w:pPr>
+        <w:pStyle w:val="BodyText"/>
+      </w:pPr>
+      <w:r>
+        <w:rPr>
+          <w:b/>
+          <w:bCs/>
+        </w:rPr>
+        <w:t xml:space="preserve">Thermal data:</w:t>
+      </w:r>
+      <w:r>
+        <w:t xml:space="preserve"> </w:t>
+      </w:r>
+      <w:r>
+        <w:t xml:space="preserve">Landsat 8/9 Collection 2 surface temperature (</w:t>
+      </w:r>
+      <w:r>
+        <w:rPr>
+          <w:rStyle w:val="VerbatimChar"/>
+        </w:rPr>
+        <w:t xml:space="preserve">ST_B10</w:t>
+      </w:r>
+      <w:r>
+        <w:t xml:space="preserve">),</w:t>
+      </w:r>
+      <w:r>
+        <w:t xml:space="preserve"> </w:t>
+      </w:r>
+      <w:r>
+        <w:t xml:space="preserve">summer months only (June–September, the annual thermal maximum), converted</w:t>
+      </w:r>
+      <w:r>
+        <w:t xml:space="preserve"> </w:t>
+      </w:r>
+      <w:r>
+        <w:t xml:space="preserve">to Celsius and masked to water pixels only (using the Sentinel-2 composite’s</w:t>
+      </w:r>
+      <w:r>
+        <w:t xml:space="preserve"> </w:t>
+      </w:r>
+      <w:r>
+        <w:t xml:space="preserve">MNDWI band) so that hot dry land cannot skew the thermal-stress signal.</w:t>
+      </w:r>
+    </w:p>
+    <w:p>
+      <w:pPr>
+        <w:pStyle w:val="BodyText"/>
+      </w:pPr>
+      <w:r>
+        <w:rPr>
+          <w:b/>
+          <w:bCs/>
+        </w:rPr>
+        <w:t xml:space="preserve">Training and reference data:</w:t>
+      </w:r>
+      <w:r>
+        <w:t xml:space="preserve"> </w:t>
+      </w:r>
+      <w:r>
+        <w:t xml:space="preserve">vector habitat polygons from the</w:t>
+      </w:r>
+      <w:r>
+        <w:t xml:space="preserve"> </w:t>
+      </w:r>
+      <w:r>
+        <w:t xml:space="preserve">Environment Agency – Abu Dhabi (EAD), clipped to the study area:</w:t>
+      </w:r>
+      <w:r>
+        <w:t xml:space="preserve"> </w:t>
+      </w:r>
+      <w:r>
+        <w:t xml:space="preserve">- 118 seagrass-bed polygons and 171 unconsolidated-bottom (non-seagrass)</w:t>
+      </w:r>
+      <w:r>
+        <w:t xml:space="preserve"> </w:t>
+      </w:r>
+      <w:r>
+        <w:t xml:space="preserve">polygons, used as positive/negative training data.</w:t>
+      </w:r>
+      <w:r>
+        <w:t xml:space="preserve"> </w:t>
+      </w:r>
+      <w:r>
+        <w:t xml:space="preserve">- A further 118-polygon EAD seagrass layer, kept entirely separate from</w:t>
+      </w:r>
+      <w:r>
+        <w:t xml:space="preserve"> </w:t>
+      </w:r>
+      <w:r>
+        <w:t xml:space="preserve">training, used as an independent reference/validation layer.</w:t>
+      </w:r>
+      <w:r>
+        <w:t xml:space="preserve"> </w:t>
+      </w:r>
+      <w:r>
+        <w:t xml:space="preserve">- A region-wide EAD seagrass layer (1,954 polygons, ~2,922 km²) used for</w:t>
+      </w:r>
+      <w:r>
+        <w:t xml:space="preserve"> </w:t>
+      </w:r>
+      <w:r>
+        <w:t xml:space="preserve">broader context, not for training or accuracy assessment.</w:t>
+      </w:r>
+    </w:p>
+    <w:p>
+      <w:pPr>
+        <w:pStyle w:val="BodyText"/>
+      </w:pPr>
+      <w:r>
+        <w:t xml:space="preserve">All vector data uses WGS84/CRS84 coordinates. The binary class scheme</w:t>
+      </w:r>
+      <w:r>
+        <w:t xml:space="preserve"> </w:t>
+      </w:r>
+      <w:r>
+        <w:t xml:space="preserve">(</w:t>
+      </w:r>
+      <w:r>
+        <w:rPr>
+          <w:rStyle w:val="VerbatimChar"/>
+        </w:rPr>
+        <w:t xml:space="preserve">1 = seagrass</w:t>
+      </w:r>
+      <w:r>
+        <w:t xml:space="preserve">,</w:t>
+      </w:r>
+      <w:r>
+        <w:t xml:space="preserve"> </w:t>
+      </w:r>
+      <w:r>
+        <w:rPr>
+          <w:rStyle w:val="VerbatimChar"/>
+        </w:rPr>
+        <w:t xml:space="preserve">0 = non-seagrass</w:t>
+      </w:r>
+      <w:r>
+        <w:t xml:space="preserve">) was locked to match this training</w:t>
+      </w:r>
+      <w:r>
+        <w:t xml:space="preserve"> </w:t>
+      </w:r>
+      <w:r>
+        <w:t xml:space="preserve">data’s own structure, replacing an earlier four-class design.</w:t>
+      </w:r>
+    </w:p>
+    <w:p>
+      <w:pPr>
+        <w:pStyle w:val="CaptionedFigure"/>
+      </w:pPr>
+      <w:r>
+        <w:drawing>
+          <wp:inline>
+            <wp:extent cx="5334000" cy="5009130"/>
+            <wp:effectExtent b="0" l="0" r="0" t="0"/>
+            <wp:docPr descr="Official EAD seagrass reference beds (118 polygons) within the 774.6 km² study area — the ground truth the classifier is trained and validated against." title="" id="27" name="Picture"/>
+            <a:graphic>
+              <a:graphicData uri="http://schemas.openxmlformats.org/drawingml/2006/picture">
+                <pic:pic>
+                  <pic:nvPicPr>
+                    <pic:cNvPr descr="../D_dashboard/figures/B_ead_seagrass_extent.png" id="28" name="Picture"/>
+                    <pic:cNvPicPr>
+                      <a:picLocks noChangeArrowheads="1" noChangeAspect="1"/>
+                    </pic:cNvPicPr>
+                  </pic:nvPicPr>
+                  <pic:blipFill>
+                    <a:blip r:embed="rId26"/>
                     <a:stretch>
                       <a:fillRect/>
                     </a:stretch>
@@ -1841,8 +1896,8 @@
         <w:t xml:space="preserve">Official EAD seagrass reference beds (118 polygons) within the 774.6 km² study area — the ground truth the classifier is trained and validated against.</w:t>
       </w:r>
     </w:p>
-    <w:bookmarkEnd w:id="26"/>
-    <w:bookmarkStart w:id="30" w:name="seagrass-classification-track-b"/>
+    <w:bookmarkEnd w:id="29"/>
+    <w:bookmarkStart w:id="36" w:name="seagrass-classification-track-b"/>
     <w:p>
       <w:pPr>
         <w:pStyle w:val="Heading2"/>
@@ -2035,20 +2090,20 @@
       <w:r>
         <w:drawing>
           <wp:inline>
-            <wp:extent cx="5334000" cy="8352916"/>
+            <wp:extent cx="5334000" cy="8434351"/>
             <wp:effectExtent b="0" l="0" r="0" t="0"/>
-            <wp:docPr descr="The Track B seagrass-classification workflow, from Sentinel-2 imagery through the 14-band feature stack and Random Forest classifier to a validated seagrass map." title="" id="28" name="Picture"/>
+            <wp:docPr descr="The Track B seagrass-classification workflow, from Sentinel-2 imagery through the 14-band feature stack and Random Forest classifier to a validated seagrass map." title="" id="31" name="Picture"/>
             <a:graphic>
               <a:graphicData uri="http://schemas.openxmlformats.org/drawingml/2006/picture">
                 <pic:pic>
                   <pic:nvPicPr>
-                    <pic:cNvPr descr="../diagrams/3_classification_workflow.png" id="29" name="Picture"/>
+                    <pic:cNvPr descr="../diagrams/3_classification_workflow.png" id="32" name="Picture"/>
                     <pic:cNvPicPr>
                       <a:picLocks noChangeArrowheads="1" noChangeAspect="1"/>
                     </pic:cNvPicPr>
                   </pic:nvPicPr>
                   <pic:blipFill>
-                    <a:blip r:embed="rId27"/>
+                    <a:blip r:embed="rId30"/>
                     <a:stretch>
                       <a:fillRect/>
                     </a:stretch>
@@ -2056,7 +2111,7 @@
                   <pic:spPr bwMode="auto">
                     <a:xfrm>
                       <a:off x="0" y="0"/>
-                      <a:ext cx="5334000" cy="8352916"/>
+                      <a:ext cx="5334000" cy="8434351"/>
                     </a:xfrm>
                     <a:prstGeom prst="rect">
                       <a:avLst/>
@@ -2083,8 +2138,63 @@
         <w:t xml:space="preserve">The Track B seagrass-classification workflow, from Sentinel-2 imagery through the 14-band feature stack and Random Forest classifier to a validated seagrass map.</w:t>
       </w:r>
     </w:p>
-    <w:bookmarkEnd w:id="30"/>
-    <w:bookmarkStart w:id="37" w:name="habitat-risk-model-track-c"/>
+    <w:p>
+      <w:pPr>
+        <w:pStyle w:val="CaptionedFigure"/>
+      </w:pPr>
+      <w:r>
+        <w:drawing>
+          <wp:inline>
+            <wp:extent cx="5334000" cy="2136133"/>
+            <wp:effectExtent b="0" l="0" r="0" t="0"/>
+            <wp:docPr descr="Change detection: the same trained classifier is applied to the 2019 and 2024 composites and the two maps are differenced into four change classes — stable non-seagrass, stable seagrass, gain, and loss." title="" id="34" name="Picture"/>
+            <a:graphic>
+              <a:graphicData uri="http://schemas.openxmlformats.org/drawingml/2006/picture">
+                <pic:pic>
+                  <pic:nvPicPr>
+                    <pic:cNvPr descr="../diagrams/4_change_detection.png" id="35" name="Picture"/>
+                    <pic:cNvPicPr>
+                      <a:picLocks noChangeArrowheads="1" noChangeAspect="1"/>
+                    </pic:cNvPicPr>
+                  </pic:nvPicPr>
+                  <pic:blipFill>
+                    <a:blip r:embed="rId33"/>
+                    <a:stretch>
+                      <a:fillRect/>
+                    </a:stretch>
+                  </pic:blipFill>
+                  <pic:spPr bwMode="auto">
+                    <a:xfrm>
+                      <a:off x="0" y="0"/>
+                      <a:ext cx="5334000" cy="2136133"/>
+                    </a:xfrm>
+                    <a:prstGeom prst="rect">
+                      <a:avLst/>
+                    </a:prstGeom>
+                    <a:noFill/>
+                    <a:ln w="9525">
+                      <a:noFill/>
+                      <a:headEnd/>
+                      <a:tailEnd/>
+                    </a:ln>
+                  </pic:spPr>
+                </pic:pic>
+              </a:graphicData>
+            </a:graphic>
+          </wp:inline>
+        </w:drawing>
+      </w:r>
+    </w:p>
+    <w:p>
+      <w:pPr>
+        <w:pStyle w:val="ImageCaption"/>
+      </w:pPr>
+      <w:r>
+        <w:t xml:space="preserve">Change detection: the same trained classifier is applied to the 2019 and 2024 composites and the two maps are differenced into four change classes — stable non-seagrass, stable seagrass, gain, and loss.</w:t>
+      </w:r>
+    </w:p>
+    <w:bookmarkEnd w:id="36"/>
+    <w:bookmarkStart w:id="43" w:name="habitat-risk-model-track-c"/>
     <w:p>
       <w:pPr>
         <w:pStyle w:val="Heading2"/>
@@ -2677,20 +2787,20 @@
       <w:r>
         <w:drawing>
           <wp:inline>
-            <wp:extent cx="5334000" cy="1836131"/>
+            <wp:extent cx="5334000" cy="1871010"/>
             <wp:effectExtent b="0" l="0" r="0" t="0"/>
-            <wp:docPr descr="The Track C habitat-risk model: a habitat-value layer multiplied by a weighted threat layer, rescaled, classified, and ranked into hotspots." title="" id="32" name="Picture"/>
+            <wp:docPr descr="The Track C habitat-risk model: a habitat-value layer multiplied by a weighted threat layer, rescaled, classified, and ranked into hotspots." title="" id="38" name="Picture"/>
             <a:graphic>
               <a:graphicData uri="http://schemas.openxmlformats.org/drawingml/2006/picture">
                 <pic:pic>
                   <pic:nvPicPr>
-                    <pic:cNvPr descr="../diagrams/5_risk_model.png" id="33" name="Picture"/>
+                    <pic:cNvPr descr="../diagrams/5_risk_model.png" id="39" name="Picture"/>
                     <pic:cNvPicPr>
                       <a:picLocks noChangeArrowheads="1" noChangeAspect="1"/>
                     </pic:cNvPicPr>
                   </pic:nvPicPr>
                   <pic:blipFill>
-                    <a:blip r:embed="rId31"/>
+                    <a:blip r:embed="rId37"/>
                     <a:stretch>
                       <a:fillRect/>
                     </a:stretch>
@@ -2698,7 +2808,7 @@
                   <pic:spPr bwMode="auto">
                     <a:xfrm>
                       <a:off x="0" y="0"/>
-                      <a:ext cx="5334000" cy="1836131"/>
+                      <a:ext cx="5334000" cy="1871010"/>
                     </a:xfrm>
                     <a:prstGeom prst="rect">
                       <a:avLst/>
@@ -2732,20 +2842,20 @@
       <w:r>
         <w:drawing>
           <wp:inline>
-            <wp:extent cx="5334000" cy="2431482"/>
+            <wp:extent cx="5334000" cy="2468323"/>
             <wp:effectExtent b="0" l="0" r="0" t="0"/>
-            <wp:docPr descr="The weighted threat model: five normalised factors combined in documented proportions into a single threat-pressure surface." title="" id="35" name="Picture"/>
+            <wp:docPr descr="The weighted threat model: five normalised factors combined in documented proportions into a single threat-pressure surface." title="" id="41" name="Picture"/>
             <a:graphic>
               <a:graphicData uri="http://schemas.openxmlformats.org/drawingml/2006/picture">
                 <pic:pic>
                   <pic:nvPicPr>
-                    <pic:cNvPr descr="../diagrams/6_threat_model.png" id="36" name="Picture"/>
+                    <pic:cNvPr descr="../diagrams/6_threat_model.png" id="42" name="Picture"/>
                     <pic:cNvPicPr>
                       <a:picLocks noChangeArrowheads="1" noChangeAspect="1"/>
                     </pic:cNvPicPr>
                   </pic:nvPicPr>
                   <pic:blipFill>
-                    <a:blip r:embed="rId34"/>
+                    <a:blip r:embed="rId40"/>
                     <a:stretch>
                       <a:fillRect/>
                     </a:stretch>
@@ -2753,7 +2863,7 @@
                   <pic:spPr bwMode="auto">
                     <a:xfrm>
                       <a:off x="0" y="0"/>
-                      <a:ext cx="5334000" cy="2431482"/>
+                      <a:ext cx="5334000" cy="2468323"/>
                     </a:xfrm>
                     <a:prstGeom prst="rect">
                       <a:avLst/>
@@ -2780,8 +2890,8 @@
         <w:t xml:space="preserve">The weighted threat model: five normalised factors combined in documented proportions into a single threat-pressure surface.</w:t>
       </w:r>
     </w:p>
-    <w:bookmarkEnd w:id="37"/>
-    <w:bookmarkStart w:id="38" w:name="validation-approach"/>
+    <w:bookmarkEnd w:id="43"/>
+    <w:bookmarkStart w:id="44" w:name="validation-approach"/>
     <w:p>
       <w:pPr>
         <w:pStyle w:val="Heading2"/>
@@ -2906,8 +3016,8 @@
         <w:t xml:space="preserve">resulting hotspots robust to the exact weighting chosen?</w:t>
       </w:r>
     </w:p>
-    <w:bookmarkEnd w:id="38"/>
-    <w:bookmarkStart w:id="39" w:name="implementation-and-reproducibility"/>
+    <w:bookmarkEnd w:id="44"/>
+    <w:bookmarkStart w:id="45" w:name="implementation-and-reproducibility"/>
     <w:p>
       <w:pPr>
         <w:pStyle w:val="Heading2"/>
@@ -3008,9 +3118,9 @@
         <w:t xml:space="preserve">— no proprietary or purchased data is required anywhere in the pipeline.</w:t>
       </w:r>
     </w:p>
-    <w:bookmarkEnd w:id="39"/>
-    <w:bookmarkEnd w:id="40"/>
-    <w:bookmarkStart w:id="64" w:name="results"/>
+    <w:bookmarkEnd w:id="45"/>
+    <w:bookmarkEnd w:id="46"/>
+    <w:bookmarkStart w:id="70" w:name="results"/>
     <w:p>
       <w:pPr>
         <w:pStyle w:val="Heading1"/>
@@ -3048,7 +3158,7 @@
         <w:t xml:space="preserve">generated directly from these results, not illustratively.</w:t>
       </w:r>
     </w:p>
-    <w:bookmarkStart w:id="50" w:name="seagrass-classification-accuracy"/>
+    <w:bookmarkStart w:id="56" w:name="seagrass-classification-accuracy"/>
     <w:p>
       <w:pPr>
         <w:pStyle w:val="Heading2"/>
@@ -3372,18 +3482,18 @@
           <wp:inline>
             <wp:extent cx="5334000" cy="2816130"/>
             <wp:effectExtent b="0" l="0" r="0" t="0"/>
-            <wp:docPr descr="Confusion matrices: original vs. class-balanced Random Forest" title="" id="42" name="Picture"/>
+            <wp:docPr descr="Confusion matrices: original vs. class-balanced Random Forest" title="" id="48" name="Picture"/>
             <a:graphic>
               <a:graphicData uri="http://schemas.openxmlformats.org/drawingml/2006/picture">
                 <pic:pic>
                   <pic:nvPicPr>
-                    <pic:cNvPr descr="../D_dashboard/figures/B4_confusion_matrices.png" id="43" name="Picture"/>
+                    <pic:cNvPr descr="../D_dashboard/figures/B4_confusion_matrices.png" id="49" name="Picture"/>
                     <pic:cNvPicPr>
                       <a:picLocks noChangeArrowheads="1" noChangeAspect="1"/>
                     </pic:cNvPicPr>
                   </pic:nvPicPr>
                   <pic:blipFill>
-                    <a:blip r:embed="rId41"/>
+                    <a:blip r:embed="rId47"/>
                     <a:stretch>
                       <a:fillRect/>
                     </a:stretch>
@@ -3427,18 +3537,18 @@
           <wp:inline>
             <wp:extent cx="5334000" cy="2514321"/>
             <wp:effectExtent b="0" l="0" r="0" t="0"/>
-            <wp:docPr descr="Accuracy metrics compared against the published target range" title="" id="45" name="Picture"/>
+            <wp:docPr descr="Accuracy metrics compared against the published target range" title="" id="51" name="Picture"/>
             <a:graphic>
               <a:graphicData uri="http://schemas.openxmlformats.org/drawingml/2006/picture">
                 <pic:pic>
                   <pic:nvPicPr>
-                    <pic:cNvPr descr="../D_dashboard/figures/B4_accuracy_comparison.png" id="46" name="Picture"/>
+                    <pic:cNvPr descr="../D_dashboard/figures/B4_accuracy_comparison.png" id="52" name="Picture"/>
                     <pic:cNvPicPr>
                       <a:picLocks noChangeArrowheads="1" noChangeAspect="1"/>
                     </pic:cNvPicPr>
                   </pic:nvPicPr>
                   <pic:blipFill>
-                    <a:blip r:embed="rId44"/>
+                    <a:blip r:embed="rId50"/>
                     <a:stretch>
                       <a:fillRect/>
                     </a:stretch>
@@ -3536,18 +3646,18 @@
           <wp:inline>
             <wp:extent cx="5334000" cy="4129133"/>
             <wp:effectExtent b="0" l="0" r="0" t="0"/>
-            <wp:docPr descr="Random Forest feature importance" title="" id="48" name="Picture"/>
+            <wp:docPr descr="Random Forest feature importance" title="" id="54" name="Picture"/>
             <a:graphic>
               <a:graphicData uri="http://schemas.openxmlformats.org/drawingml/2006/picture">
                 <pic:pic>
                   <pic:nvPicPr>
-                    <pic:cNvPr descr="../D_dashboard/figures/B5_feature_importance.png" id="49" name="Picture"/>
+                    <pic:cNvPr descr="../D_dashboard/figures/B5_feature_importance.png" id="55" name="Picture"/>
                     <pic:cNvPicPr>
                       <a:picLocks noChangeArrowheads="1" noChangeAspect="1"/>
                     </pic:cNvPicPr>
                   </pic:nvPicPr>
                   <pic:blipFill>
-                    <a:blip r:embed="rId47"/>
+                    <a:blip r:embed="rId53"/>
                     <a:stretch>
                       <a:fillRect/>
                     </a:stretch>
@@ -3582,8 +3692,8 @@
         <w:t xml:space="preserve">Random Forest feature importance</w:t>
       </w:r>
     </w:p>
-    <w:bookmarkEnd w:id="50"/>
-    <w:bookmarkStart w:id="57" w:name="habitat-risk-index"/>
+    <w:bookmarkEnd w:id="56"/>
+    <w:bookmarkStart w:id="63" w:name="habitat-risk-index"/>
     <w:p>
       <w:pPr>
         <w:pStyle w:val="Heading2"/>
@@ -3725,18 +3835,18 @@
           <wp:inline>
             <wp:extent cx="5334000" cy="3253931"/>
             <wp:effectExtent b="0" l="0" r="0" t="0"/>
-            <wp:docPr descr="Ranked risk hotspots by area, coloured by dominant threat" title="" id="52" name="Picture"/>
+            <wp:docPr descr="Ranked risk hotspots by area, coloured by dominant threat" title="" id="58" name="Picture"/>
             <a:graphic>
               <a:graphicData uri="http://schemas.openxmlformats.org/drawingml/2006/picture">
                 <pic:pic>
                   <pic:nvPicPr>
-                    <pic:cNvPr descr="../D_dashboard/figures/C4_hotspot_ranking.png" id="53" name="Picture"/>
+                    <pic:cNvPr descr="../D_dashboard/figures/C4_hotspot_ranking.png" id="59" name="Picture"/>
                     <pic:cNvPicPr>
                       <a:picLocks noChangeArrowheads="1" noChangeAspect="1"/>
                     </pic:cNvPicPr>
                   </pic:nvPicPr>
                   <pic:blipFill>
-                    <a:blip r:embed="rId51"/>
+                    <a:blip r:embed="rId57"/>
                     <a:stretch>
                       <a:fillRect/>
                     </a:stretch>
@@ -3780,18 +3890,18 @@
           <wp:inline>
             <wp:extent cx="5334000" cy="3556000"/>
             <wp:effectExtent b="0" l="0" r="0" t="0"/>
-            <wp:docPr descr="The habitat-risk map across the study area (blue = Very Low → red = Very High), with ranked hotspot markers on the interactive dashboard. The red corridor through the centre is the vessel-dominated navigation channel." title="" id="55" name="Picture"/>
+            <wp:docPr descr="The habitat-risk map across the study area (blue = Very Low → red = Very High), with ranked hotspot markers on the interactive dashboard. The red corridor through the centre is the vessel-dominated navigation channel." title="" id="61" name="Picture"/>
             <a:graphic>
               <a:graphicData uri="http://schemas.openxmlformats.org/drawingml/2006/picture">
                 <pic:pic>
                   <pic:nvPicPr>
-                    <pic:cNvPr descr="../D_dashboard/risk_map_static.png" id="56" name="Picture"/>
+                    <pic:cNvPr descr="../D_dashboard/risk_map_static.png" id="62" name="Picture"/>
                     <pic:cNvPicPr>
                       <a:picLocks noChangeArrowheads="1" noChangeAspect="1"/>
                     </pic:cNvPicPr>
                   </pic:nvPicPr>
                   <pic:blipFill>
-                    <a:blip r:embed="rId54"/>
+                    <a:blip r:embed="rId60"/>
                     <a:stretch>
                       <a:fillRect/>
                     </a:stretch>
@@ -3826,8 +3936,8 @@
         <w:t xml:space="preserve">The habitat-risk map across the study area (blue = Very Low → red = Very High), with ranked hotspot markers on the interactive dashboard. The red corridor through the centre is the vessel-dominated navigation channel.</w:t>
       </w:r>
     </w:p>
-    <w:bookmarkEnd w:id="57"/>
-    <w:bookmarkStart w:id="58" w:name="model-validation"/>
+    <w:bookmarkEnd w:id="63"/>
+    <w:bookmarkStart w:id="64" w:name="model-validation"/>
     <w:p>
       <w:pPr>
         <w:pStyle w:val="Heading2"/>
@@ -3977,8 +4087,8 @@
         <w:t xml:space="preserve">risk uniformly or at random locations.</w:t>
       </w:r>
     </w:p>
-    <w:bookmarkEnd w:id="58"/>
-    <w:bookmarkStart w:id="62" w:name="weight-sensitivity-analysis"/>
+    <w:bookmarkEnd w:id="64"/>
+    <w:bookmarkStart w:id="68" w:name="weight-sensitivity-analysis"/>
     <w:p>
       <w:pPr>
         <w:pStyle w:val="Heading2"/>
@@ -4279,18 +4389,18 @@
           <wp:inline>
             <wp:extent cx="5334000" cy="3189861"/>
             <wp:effectExtent b="0" l="0" r="0" t="0"/>
-            <wp:docPr descr="Weight-sensitivity analysis: change in high-risk area per +/-0.10 weight perturbation" title="" id="60" name="Picture"/>
+            <wp:docPr descr="Weight-sensitivity analysis: change in high-risk area per +/-0.10 weight perturbation" title="" id="66" name="Picture"/>
             <a:graphic>
               <a:graphicData uri="http://schemas.openxmlformats.org/drawingml/2006/picture">
                 <pic:pic>
                   <pic:nvPicPr>
-                    <pic:cNvPr descr="../D_dashboard/figures/C5_weight_sensitivity.png" id="61" name="Picture"/>
+                    <pic:cNvPr descr="../D_dashboard/figures/C5_weight_sensitivity.png" id="67" name="Picture"/>
                     <pic:cNvPicPr>
                       <a:picLocks noChangeArrowheads="1" noChangeAspect="1"/>
                     </pic:cNvPicPr>
                   </pic:nvPicPr>
                   <pic:blipFill>
-                    <a:blip r:embed="rId59"/>
+                    <a:blip r:embed="rId65"/>
                     <a:stretch>
                       <a:fillRect/>
                     </a:stretch>
@@ -4325,8 +4435,8 @@
         <w:t xml:space="preserve">Weight-sensitivity analysis: change in high-risk area per +/-0.10 weight perturbation</w:t>
       </w:r>
     </w:p>
-    <w:bookmarkEnd w:id="62"/>
-    <w:bookmarkStart w:id="63" w:name="delivered-outputs"/>
+    <w:bookmarkEnd w:id="68"/>
+    <w:bookmarkStart w:id="69" w:name="delivered-outputs"/>
     <w:p>
       <w:pPr>
         <w:pStyle w:val="Heading2"/>
@@ -4418,9 +4528,9 @@
         <w:t xml:space="preserve">.</w:t>
       </w:r>
     </w:p>
-    <w:bookmarkEnd w:id="63"/>
-    <w:bookmarkEnd w:id="64"/>
-    <w:bookmarkStart w:id="68" w:name="impact"/>
+    <w:bookmarkEnd w:id="69"/>
+    <w:bookmarkEnd w:id="70"/>
+    <w:bookmarkStart w:id="74" w:name="impact"/>
     <w:p>
       <w:pPr>
         <w:pStyle w:val="Heading1"/>
@@ -4429,7 +4539,7 @@
         <w:t xml:space="preserve">5. Impact</w:t>
       </w:r>
     </w:p>
-    <w:bookmarkStart w:id="65" w:name="local-impact-abu-dhabi-uae"/>
+    <w:bookmarkStart w:id="71" w:name="local-impact-abu-dhabi-uae"/>
     <w:p>
       <w:pPr>
         <w:pStyle w:val="Heading2"/>
@@ -4624,8 +4734,8 @@
         <w:t xml:space="preserve">“the core matters.”</w:t>
       </w:r>
     </w:p>
-    <w:bookmarkEnd w:id="65"/>
-    <w:bookmarkStart w:id="66" w:name="regional-and-global-scale"/>
+    <w:bookmarkEnd w:id="71"/>
+    <w:bookmarkStart w:id="72" w:name="regional-and-global-scale"/>
     <w:p>
       <w:pPr>
         <w:pStyle w:val="Heading2"/>
@@ -4778,8 +4888,8 @@
         <w:t xml:space="preserve">GIS consulting is not a realistic option.</w:t>
       </w:r>
     </w:p>
-    <w:bookmarkEnd w:id="66"/>
-    <w:bookmarkStart w:id="67" w:name="scope-of-these-claims"/>
+    <w:bookmarkEnd w:id="72"/>
+    <w:bookmarkStart w:id="73" w:name="scope-of-these-claims"/>
     <w:p>
       <w:pPr>
         <w:pStyle w:val="Heading2"/>
@@ -4832,9 +4942,9 @@
         <w:t xml:space="preserve">act on, not less.</w:t>
       </w:r>
     </w:p>
-    <w:bookmarkEnd w:id="67"/>
-    <w:bookmarkEnd w:id="68"/>
-    <w:bookmarkStart w:id="74" w:name="competition-prompt-answers"/>
+    <w:bookmarkEnd w:id="73"/>
+    <w:bookmarkEnd w:id="74"/>
+    <w:bookmarkStart w:id="80" w:name="competition-prompt-answers"/>
     <w:p>
       <w:pPr>
         <w:pStyle w:val="Heading1"/>
@@ -4869,7 +4979,7 @@
         <w:t xml:space="preserve">Prototypes for Humanity 2026 Entry Guide.</w:t>
       </w:r>
     </w:p>
-    <w:bookmarkStart w:id="69" w:name="what-problem-are-you-addressing"/>
+    <w:bookmarkStart w:id="75" w:name="what-problem-are-you-addressing"/>
     <w:p>
       <w:pPr>
         <w:pStyle w:val="Heading2"/>
@@ -4946,8 +5056,8 @@
         <w:t xml:space="preserve">dugong survival, and where limited protection resources should go first.</w:t>
       </w:r>
     </w:p>
-    <w:bookmarkEnd w:id="69"/>
-    <w:bookmarkStart w:id="70" w:name="how-are-existing-solutions-failing"/>
+    <w:bookmarkEnd w:id="75"/>
+    <w:bookmarkStart w:id="76" w:name="how-are-existing-solutions-failing"/>
     <w:p>
       <w:pPr>
         <w:pStyle w:val="Heading2"/>
@@ -5059,8 +5169,8 @@
         <w:t xml:space="preserve">one reproducible, auditable risk output specific to dugong habitat.</w:t>
       </w:r>
     </w:p>
-    <w:bookmarkEnd w:id="70"/>
-    <w:bookmarkStart w:id="71" w:name="what-is-your-alternative-solution"/>
+    <w:bookmarkEnd w:id="76"/>
+    <w:bookmarkStart w:id="77" w:name="what-is-your-alternative-solution"/>
     <w:p>
       <w:pPr>
         <w:pStyle w:val="Heading2"/>
@@ -5134,8 +5244,8 @@
         <w:t xml:space="preserve">underlying code and data so every step can be reproduced or audited.</w:t>
       </w:r>
     </w:p>
-    <w:bookmarkEnd w:id="71"/>
-    <w:bookmarkStart w:id="72" w:name="how-does-it-perform-better"/>
+    <w:bookmarkEnd w:id="77"/>
+    <w:bookmarkStart w:id="78" w:name="how-does-it-perform-better"/>
     <w:p>
       <w:pPr>
         <w:pStyle w:val="Heading2"/>
@@ -5218,8 +5328,8 @@
         <w:t xml:space="preserve">repeatable monitoring tool.</w:t>
       </w:r>
     </w:p>
-    <w:bookmarkEnd w:id="72"/>
-    <w:bookmarkStart w:id="73" w:name="what-impact-does-your-solution-have"/>
+    <w:bookmarkEnd w:id="78"/>
+    <w:bookmarkStart w:id="79" w:name="what-impact-does-your-solution-have"/>
     <w:p>
       <w:pPr>
         <w:pStyle w:val="Heading2"/>
@@ -5290,9 +5400,9 @@
         <w:t xml:space="preserve">bespoke GIS consulting would otherwise impose.</w:t>
       </w:r>
     </w:p>
-    <w:bookmarkEnd w:id="73"/>
-    <w:bookmarkEnd w:id="74"/>
-    <w:bookmarkStart w:id="76" w:name="references"/>
+    <w:bookmarkEnd w:id="79"/>
+    <w:bookmarkEnd w:id="80"/>
+    <w:bookmarkStart w:id="82" w:name="references"/>
     <w:p>
       <w:pPr>
         <w:pStyle w:val="Heading1"/>
@@ -5725,7 +5835,7 @@
         </w:pict>
       </w:r>
     </w:p>
-    <w:bookmarkStart w:id="75" w:name="X84fc92f875cd9a0d499aff9f14f6b65fb1292bd"/>
+    <w:bookmarkStart w:id="81" w:name="X84fc92f875cd9a0d499aff9f14f6b65fb1292bd"/>
     <w:p>
       <w:pPr>
         <w:pStyle w:val="Heading2"/>
@@ -5782,9 +5892,9 @@
         <w:t xml:space="preserve">Marine habitat vector data: Environment Agency – Abu Dhabi (EAD).</w:t>
       </w:r>
     </w:p>
-    <w:bookmarkEnd w:id="75"/>
-    <w:bookmarkEnd w:id="76"/>
-    <w:bookmarkStart w:id="81" w:name="limitations"/>
+    <w:bookmarkEnd w:id="81"/>
+    <w:bookmarkEnd w:id="82"/>
+    <w:bookmarkStart w:id="87" w:name="limitations"/>
     <w:p>
       <w:pPr>
         <w:pStyle w:val="Heading1"/>
@@ -5813,7 +5923,7 @@
         <w:t xml:space="preserve">(Section 1.3) — not a formality.</w:t>
       </w:r>
     </w:p>
-    <w:bookmarkStart w:id="77" w:name="data-limitations"/>
+    <w:bookmarkStart w:id="83" w:name="data-limitations"/>
     <w:p>
       <w:pPr>
         <w:pStyle w:val="Heading2"/>
@@ -6095,8 +6205,8 @@
         <w:t xml:space="preserve">typical thermal stress, not trend or frequency of extreme events.</w:t>
       </w:r>
     </w:p>
-    <w:bookmarkEnd w:id="77"/>
-    <w:bookmarkStart w:id="78" w:name="model-limitations"/>
+    <w:bookmarkEnd w:id="83"/>
+    <w:bookmarkStart w:id="84" w:name="model-limitations"/>
     <w:p>
       <w:pPr>
         <w:pStyle w:val="Heading2"/>
@@ -6264,8 +6374,8 @@
         <w:t xml:space="preserve">this project’s scope and timeline.</w:t>
       </w:r>
     </w:p>
-    <w:bookmarkEnd w:id="78"/>
-    <w:bookmarkStart w:id="79" w:name="engineering-reproducibility-limitations"/>
+    <w:bookmarkEnd w:id="84"/>
+    <w:bookmarkStart w:id="85" w:name="engineering-reproducibility-limitations"/>
     <w:p>
       <w:pPr>
         <w:pStyle w:val="Heading2"/>
@@ -6527,8 +6637,8 @@
         <w:t xml:space="preserve">Section 5.3).</w:t>
       </w:r>
     </w:p>
-    <w:bookmarkEnd w:id="79"/>
-    <w:bookmarkStart w:id="80" w:name="what-is-genuinely-not-yet-done"/>
+    <w:bookmarkEnd w:id="85"/>
+    <w:bookmarkStart w:id="86" w:name="what-is-genuinely-not-yet-done"/>
     <w:p>
       <w:pPr>
         <w:pStyle w:val="Heading2"/>
@@ -6590,8 +6700,8 @@
         <w:t xml:space="preserve">tracked openly in the repository’s own documentation.</w:t>
       </w:r>
     </w:p>
-    <w:bookmarkEnd w:id="80"/>
-    <w:bookmarkEnd w:id="81"/>
+    <w:bookmarkEnd w:id="86"/>
+    <w:bookmarkEnd w:id="87"/>
     <w:sectPr>
       <w:footnotePr>
         <w:numRestart w:val="eachSect"/>

</xml_diff>